<commit_message>
Publish the Vyotiq source tree to GitHub and keep generated files out of git.
Add a real .gitignore so installers, caches, synced icons/wasm, generated markdown, and local agent/editor state are not uploaded.
</commit_message>
<xml_diff>
--- a/.cursor/skills/research-current-practice/SKILL.md.docx
+++ b/.cursor/skills/research-current-practice/SKILL.md.docx
@@ -22,7 +22,7 @@
         <w:pStyle w:val="Heading2"/>
         <w:rPr/>
       </w:pPr>
-      <w:bookmarkStart w:colFirst="0" w:colLast="0" w:name="_a3gehak8ggia" w:id="0"/>
+      <w:bookmarkStart w:colFirst="0" w:colLast="0" w:name="_ca2wigihbgj9" w:id="0"/>
       <w:bookmarkEnd w:id="0"/>
       <w:r>
         <w:rPr>
@@ -36,7 +36,7 @@
         <w:pStyle w:val="Heading1"/>
         <w:rPr/>
       </w:pPr>
-      <w:bookmarkStart w:colFirst="0" w:colLast="0" w:name="_2joz62coma5c" w:id="1"/>
+      <w:bookmarkStart w:colFirst="0" w:colLast="0" w:name="_mjl5xrleb2yt" w:id="1"/>
       <w:bookmarkEnd w:id="1"/>
       <w:r>
         <w:rPr>
@@ -50,7 +50,7 @@
         <w:pStyle w:val="Heading2"/>
         <w:rPr/>
       </w:pPr>
-      <w:bookmarkStart w:colFirst="0" w:colLast="0" w:name="_4lmkrmqxhmhb" w:id="2"/>
+      <w:bookmarkStart w:colFirst="0" w:colLast="0" w:name="_eez8eyqjxc0y" w:id="2"/>
       <w:bookmarkEnd w:id="2"/>
       <w:r>
         <w:rPr>
@@ -75,7 +75,7 @@
         <w:pStyle w:val="Heading2"/>
         <w:rPr/>
       </w:pPr>
-      <w:bookmarkStart w:colFirst="0" w:colLast="0" w:name="_p0ougm6cu24m" w:id="3"/>
+      <w:bookmarkStart w:colFirst="0" w:colLast="0" w:name="_v334r97tul5t" w:id="3"/>
       <w:bookmarkEnd w:id="3"/>
       <w:r>
         <w:rPr>
@@ -91,6 +91,7 @@
           <w:numId w:val="1"/>
         </w:numPr>
         <w:ind w:left="720" w:hanging="360"/>
+        <w:rPr/>
       </w:pPr>
       <w:r>
         <w:rPr>
@@ -106,6 +107,7 @@
           <w:numId w:val="1"/>
         </w:numPr>
         <w:ind w:left="720" w:hanging="360"/>
+        <w:rPr/>
       </w:pPr>
       <w:r>
         <w:rPr>
@@ -121,6 +123,7 @@
           <w:numId w:val="1"/>
         </w:numPr>
         <w:ind w:left="720" w:hanging="360"/>
+        <w:rPr/>
       </w:pPr>
       <w:r>
         <w:rPr>
@@ -136,6 +139,7 @@
           <w:numId w:val="1"/>
         </w:numPr>
         <w:ind w:left="720" w:hanging="360"/>
+        <w:rPr/>
       </w:pPr>
       <w:r>
         <w:rPr>
@@ -151,6 +155,7 @@
           <w:numId w:val="1"/>
         </w:numPr>
         <w:ind w:left="720" w:hanging="360"/>
+        <w:rPr/>
       </w:pPr>
       <w:r>
         <w:rPr>
@@ -178,7 +183,7 @@
         <w:pStyle w:val="Heading2"/>
         <w:rPr/>
       </w:pPr>
-      <w:bookmarkStart w:colFirst="0" w:colLast="0" w:name="_7ynsz1y7tsjc" w:id="4"/>
+      <w:bookmarkStart w:colFirst="0" w:colLast="0" w:name="_6inv2po24vuu" w:id="4"/>
       <w:bookmarkEnd w:id="4"/>
       <w:r>
         <w:rPr>

</xml_diff>